<commit_message>
feat(sprint1): auth con roles, Supabase, admin seed, cliente supabase-js
- Autenticación JWT con roles CIUDADANO/ANALISTA
- Seed automático de admin en startup
- Conexión a Supabase via Session Pooler
- Token incluye rol, email e id
- Endpoints: /auth/registro, /auth/login, /auth/me
- Frontend: authStore con esAdmin, router guards, navbar dinámica
- Frontend: AdminView para rol ANALISTA
- Frontend: @supabase/supabase-js integrado
- README actualizado para setup con Supabase
</commit_message>
<xml_diff>
--- a/VigilData_Arquitectura_4+1_v2.docx
+++ b/VigilData_Arquitectura_4+1_v2.docx
@@ -262,6 +262,7 @@
         <w:pStyle w:val="Ttulo1"/>
       </w:pPr>
       <w:r>
+        <w:lastRenderedPageBreak/>
         <w:t>1. Introducción</w:t>
       </w:r>
     </w:p>
@@ -645,6 +646,7 @@
       <w:bookmarkStart w:id="4" w:name="_heading=h.3wk0q162qab0" w:colFirst="0" w:colLast="0"/>
       <w:bookmarkEnd w:id="4"/>
       <w:r>
+        <w:lastRenderedPageBreak/>
         <w:t>EP-04 · Generación de reportes y soporte a decisiones estratégicas</w:t>
       </w:r>
     </w:p>
@@ -1536,6 +1538,7 @@
         <w:pStyle w:val="Ttulo1"/>
       </w:pPr>
       <w:r>
+        <w:lastRenderedPageBreak/>
         <w:t>4. Requerimientos del Sistema</w:t>
       </w:r>
     </w:p>
@@ -2597,6 +2600,7 @@
         <w:pStyle w:val="Ttulo1"/>
       </w:pPr>
       <w:r>
+        <w:lastRenderedPageBreak/>
         <w:t>5. Patrón Arquitectónico</w:t>
       </w:r>
     </w:p>
@@ -3648,6 +3652,7 @@
         <w:pStyle w:val="Ttulo1"/>
       </w:pPr>
       <w:r>
+        <w:lastRenderedPageBreak/>
         <w:t>6. Modelo 4+1 de Kruchten</w:t>
       </w:r>
     </w:p>
@@ -4412,6 +4417,7 @@
         <w:pStyle w:val="Ttulo2"/>
       </w:pPr>
       <w:r>
+        <w:lastRenderedPageBreak/>
         <w:t>6.1 Vista +1: Casos de Uso</w:t>
       </w:r>
     </w:p>
@@ -4577,6 +4583,7 @@
         <w:pStyle w:val="Ttulo3"/>
       </w:pPr>
       <w:r>
+        <w:lastRenderedPageBreak/>
         <w:t>6.2.2 Diagrama de Secuencia</w:t>
       </w:r>
     </w:p>
@@ -4734,6 +4741,7 @@
         <w:pStyle w:val="Ttulo3"/>
       </w:pPr>
       <w:r>
+        <w:lastRenderedPageBreak/>
         <w:t>6.2.3 Diagrama de Comunicación</w:t>
       </w:r>
     </w:p>
@@ -4806,6 +4814,7 @@
         <w:pStyle w:val="Ttulo2"/>
       </w:pPr>
       <w:r>
+        <w:lastRenderedPageBreak/>
         <w:t>6.3 Vista de Procesos</w:t>
       </w:r>
     </w:p>
@@ -5031,6 +5040,7 @@
         <w:pStyle w:val="Ttulo3"/>
       </w:pPr>
       <w:r>
+        <w:lastRenderedPageBreak/>
         <w:t>6.4.2 Diagrama de Paquetes</w:t>
       </w:r>
     </w:p>
@@ -5203,6 +5213,7 @@
         <w:pStyle w:val="Ttulo2"/>
       </w:pPr>
       <w:r>
+        <w:lastRenderedPageBreak/>
         <w:t>6.5 Vista Física</w:t>
       </w:r>
     </w:p>
@@ -5316,6 +5327,7 @@
         <w:pStyle w:val="Ttulo1"/>
       </w:pPr>
       <w:r>
+        <w:lastRenderedPageBreak/>
         <w:t>7. Conclusión</w:t>
       </w:r>
     </w:p>
@@ -5588,6 +5600,15 @@
     </w:r>
     <w:r>
       <w:rPr>
+        <w:noProof/>
+        <w:color w:val="999999"/>
+        <w:sz w:val="18"/>
+        <w:szCs w:val="18"/>
+      </w:rPr>
+      <w:t>2</w:t>
+    </w:r>
+    <w:r>
+      <w:rPr>
         <w:color w:val="999999"/>
         <w:sz w:val="18"/>
         <w:szCs w:val="18"/>
@@ -5626,6 +5647,7 @@
       </w:pBdr>
       <w:jc w:val="right"/>
     </w:pPr>
+    <w:proofErr w:type="spellStart"/>
     <w:r>
       <w:rPr>
         <w:i/>
@@ -5634,7 +5656,18 @@
         <w:sz w:val="18"/>
         <w:szCs w:val="18"/>
       </w:rPr>
-      <w:t>VigilData – Arquitectura y Modelo 4+1</w:t>
+      <w:t>VigilData</w:t>
+    </w:r>
+    <w:proofErr w:type="spellEnd"/>
+    <w:r>
+      <w:rPr>
+        <w:i/>
+        <w:iCs/>
+        <w:color w:val="999999"/>
+        <w:sz w:val="18"/>
+        <w:szCs w:val="18"/>
+      </w:rPr>
+      <w:t xml:space="preserve"> – Arquitectura y Modelo 4+1</w:t>
     </w:r>
   </w:p>
 </w:hdr>

</xml_diff>

<commit_message>
docs: consolidate docx project documentation
</commit_message>
<xml_diff>
--- a/VigilData_Arquitectura_4+1_v2.docx
+++ b/VigilData_Arquitectura_4+1_v2.docx
@@ -5528,6 +5528,1833 @@
           <w:color w:val="000000"/>
         </w:rPr>
         <w:t>Material de cátedra: Arquitectura de Software. Prof. Cristián Rojas C., Universidad Andrés Bello.</w:t>
+      </w:r>
+      <w:r>
+        <w:br w:type="page"/>
+      </w:r>
+    </w:p>
+    <w:p>
+      <w:pPr>
+        <w:pStyle w:val="Ttulo1"/>
+      </w:pPr>
+      <w:r>
+        <w:t>9. Gestión Scrum y documentación Taiga</w:t>
+      </w:r>
+    </w:p>
+    <w:p>
+      <w:r>
+        <w:t>Esta sección consolida la planificación y el seguimiento realizados en Taiga para el proyecto VigilData. La documentación se mantiene alineada con el tablero Scrum, las historias de usuario priorizadas, las tareas técnicas del equipo y los acuerdos registrados para el cierre del Sprint 1 y la preparación de los Sprints 2 y 3.</w:t>
+      </w:r>
+    </w:p>
+    <w:p>
+      <w:pPr>
+        <w:pStyle w:val="Ttulo2"/>
+      </w:pPr>
+      <w:r>
+        <w:t>9.1 Visión y alcance del producto</w:t>
+      </w:r>
+    </w:p>
+    <w:p>
+      <w:r>
+        <w:t>VigilData es una aplicación web orientada al reporte y visualización georreferenciada de incidentes de seguridad o convivencia urbana. El objetivo principal es entregar un flujo funcional mínimo que permita a una persona reportar un incidente desde su ubicación, consultar incidentes en un mapa y filtrar la información para apoyar la toma de decisiones.</w:t>
+      </w:r>
+    </w:p>
+    <w:p>
+      <w:r>
+        <w:t>- El alcance del MVP se concentra en autenticación, reporte de incidentes, visualización en mapa, filtros básicos, clasificación por riesgo y moderación de datos.</w:t>
+      </w:r>
+    </w:p>
+    <w:p>
+      <w:r>
+        <w:t>- El flujo central priorizado es: usuario autenticado, reporte con ubicación, almacenamiento del incidente y visualización de incidentes en mapa.</w:t>
+      </w:r>
+    </w:p>
+    <w:p>
+      <w:pPr>
+        <w:pStyle w:val="Ttulo2"/>
+      </w:pPr>
+      <w:r>
+        <w:t>9.2 Product Backlog priorizado</w:t>
+      </w:r>
+    </w:p>
+    <w:tbl>
+      <w:tblPr>
+        <w:tblW w:type="auto" w:w="0"/>
+        <w:tblLook w:firstColumn="1" w:firstRow="1" w:lastColumn="0" w:lastRow="0" w:noHBand="0" w:noVBand="1" w:val="04A0"/>
+      </w:tblPr>
+      <w:tblGrid>
+        <w:gridCol w:w="2340"/>
+        <w:gridCol w:w="2340"/>
+        <w:gridCol w:w="2340"/>
+        <w:gridCol w:w="2340"/>
+      </w:tblGrid>
+      <w:tr>
+        <w:tc>
+          <w:tcPr>
+            <w:tcW w:type="dxa" w:w="2340"/>
+          </w:tcPr>
+          <w:p>
+            <w:r>
+              <w:t>HU</w:t>
+            </w:r>
+          </w:p>
+        </w:tc>
+        <w:tc>
+          <w:tcPr>
+            <w:tcW w:type="dxa" w:w="2340"/>
+          </w:tcPr>
+          <w:p>
+            <w:r>
+              <w:t>Historia de usuario</w:t>
+            </w:r>
+          </w:p>
+        </w:tc>
+        <w:tc>
+          <w:tcPr>
+            <w:tcW w:type="dxa" w:w="2340"/>
+          </w:tcPr>
+          <w:p>
+            <w:r>
+              <w:t>Prioridad funcional</w:t>
+            </w:r>
+          </w:p>
+        </w:tc>
+        <w:tc>
+          <w:tcPr>
+            <w:tcW w:type="dxa" w:w="2340"/>
+          </w:tcPr>
+          <w:p>
+            <w:r>
+              <w:t>Sprint</w:t>
+            </w:r>
+          </w:p>
+        </w:tc>
+      </w:tr>
+      <w:tr>
+        <w:tc>
+          <w:tcPr>
+            <w:tcW w:type="dxa" w:w="2340"/>
+          </w:tcPr>
+          <w:p>
+            <w:r>
+              <w:t>HU-03</w:t>
+            </w:r>
+          </w:p>
+        </w:tc>
+        <w:tc>
+          <w:tcPr>
+            <w:tcW w:type="dxa" w:w="2340"/>
+          </w:tcPr>
+          <w:p>
+            <w:r>
+              <w:t>Como usuario autenticado, quiero reportar un incidente indicando descripción, categoría y ubicación GPS para registrar eventos relevantes.</w:t>
+            </w:r>
+          </w:p>
+        </w:tc>
+        <w:tc>
+          <w:tcPr>
+            <w:tcW w:type="dxa" w:w="2340"/>
+          </w:tcPr>
+          <w:p>
+            <w:r>
+              <w:t>Alta</w:t>
+            </w:r>
+          </w:p>
+        </w:tc>
+        <w:tc>
+          <w:tcPr>
+            <w:tcW w:type="dxa" w:w="2340"/>
+          </w:tcPr>
+          <w:p>
+            <w:r>
+              <w:t>Sprint 1</w:t>
+            </w:r>
+          </w:p>
+        </w:tc>
+      </w:tr>
+      <w:tr>
+        <w:tc>
+          <w:tcPr>
+            <w:tcW w:type="dxa" w:w="2340"/>
+          </w:tcPr>
+          <w:p>
+            <w:r>
+              <w:t>HU-04</w:t>
+            </w:r>
+          </w:p>
+        </w:tc>
+        <w:tc>
+          <w:tcPr>
+            <w:tcW w:type="dxa" w:w="2340"/>
+          </w:tcPr>
+          <w:p>
+            <w:r>
+              <w:t>Como usuario, quiero visualizar incidentes en un mapa para identificar zonas con eventos reportados.</w:t>
+            </w:r>
+          </w:p>
+        </w:tc>
+        <w:tc>
+          <w:tcPr>
+            <w:tcW w:type="dxa" w:w="2340"/>
+          </w:tcPr>
+          <w:p>
+            <w:r>
+              <w:t>Alta</w:t>
+            </w:r>
+          </w:p>
+        </w:tc>
+        <w:tc>
+          <w:tcPr>
+            <w:tcW w:type="dxa" w:w="2340"/>
+          </w:tcPr>
+          <w:p>
+            <w:r>
+              <w:t>Sprint 1</w:t>
+            </w:r>
+          </w:p>
+        </w:tc>
+      </w:tr>
+      <w:tr>
+        <w:tc>
+          <w:tcPr>
+            <w:tcW w:type="dxa" w:w="2340"/>
+          </w:tcPr>
+          <w:p>
+            <w:r>
+              <w:t>HU-01</w:t>
+            </w:r>
+          </w:p>
+        </w:tc>
+        <w:tc>
+          <w:tcPr>
+            <w:tcW w:type="dxa" w:w="2340"/>
+          </w:tcPr>
+          <w:p>
+            <w:r>
+              <w:t>Como usuario, quiero registrarme con correo y contraseña para acceder a la aplicación.</w:t>
+            </w:r>
+          </w:p>
+        </w:tc>
+        <w:tc>
+          <w:tcPr>
+            <w:tcW w:type="dxa" w:w="2340"/>
+          </w:tcPr>
+          <w:p>
+            <w:r>
+              <w:t>Alta</w:t>
+            </w:r>
+          </w:p>
+        </w:tc>
+        <w:tc>
+          <w:tcPr>
+            <w:tcW w:type="dxa" w:w="2340"/>
+          </w:tcPr>
+          <w:p>
+            <w:r>
+              <w:t>Sprint 2</w:t>
+            </w:r>
+          </w:p>
+        </w:tc>
+      </w:tr>
+      <w:tr>
+        <w:tc>
+          <w:tcPr>
+            <w:tcW w:type="dxa" w:w="2340"/>
+          </w:tcPr>
+          <w:p>
+            <w:r>
+              <w:t>HU-02</w:t>
+            </w:r>
+          </w:p>
+        </w:tc>
+        <w:tc>
+          <w:tcPr>
+            <w:tcW w:type="dxa" w:w="2340"/>
+          </w:tcPr>
+          <w:p>
+            <w:r>
+              <w:t>Como usuario, quiero iniciar sesión de forma segura para utilizar funcionalidades protegidas.</w:t>
+            </w:r>
+          </w:p>
+        </w:tc>
+        <w:tc>
+          <w:tcPr>
+            <w:tcW w:type="dxa" w:w="2340"/>
+          </w:tcPr>
+          <w:p>
+            <w:r>
+              <w:t>Alta</w:t>
+            </w:r>
+          </w:p>
+        </w:tc>
+        <w:tc>
+          <w:tcPr>
+            <w:tcW w:type="dxa" w:w="2340"/>
+          </w:tcPr>
+          <w:p>
+            <w:r>
+              <w:t>Sprint 2</w:t>
+            </w:r>
+          </w:p>
+        </w:tc>
+      </w:tr>
+      <w:tr>
+        <w:tc>
+          <w:tcPr>
+            <w:tcW w:type="dxa" w:w="2340"/>
+          </w:tcPr>
+          <w:p>
+            <w:r>
+              <w:t>HU-05</w:t>
+            </w:r>
+          </w:p>
+        </w:tc>
+        <w:tc>
+          <w:tcPr>
+            <w:tcW w:type="dxa" w:w="2340"/>
+          </w:tcPr>
+          <w:p>
+            <w:r>
+              <w:t>Como usuario, quiero filtrar incidentes por comuna y fecha para revisar información más específica.</w:t>
+            </w:r>
+          </w:p>
+        </w:tc>
+        <w:tc>
+          <w:tcPr>
+            <w:tcW w:type="dxa" w:w="2340"/>
+          </w:tcPr>
+          <w:p>
+            <w:r>
+              <w:t>Media alta</w:t>
+            </w:r>
+          </w:p>
+        </w:tc>
+        <w:tc>
+          <w:tcPr>
+            <w:tcW w:type="dxa" w:w="2340"/>
+          </w:tcPr>
+          <w:p>
+            <w:r>
+              <w:t>Sprint 2</w:t>
+            </w:r>
+          </w:p>
+        </w:tc>
+      </w:tr>
+      <w:tr>
+        <w:tc>
+          <w:tcPr>
+            <w:tcW w:type="dxa" w:w="2340"/>
+          </w:tcPr>
+          <w:p>
+            <w:r>
+              <w:t>HU-06</w:t>
+            </w:r>
+          </w:p>
+        </w:tc>
+        <w:tc>
+          <w:tcPr>
+            <w:tcW w:type="dxa" w:w="2340"/>
+          </w:tcPr>
+          <w:p>
+            <w:r>
+              <w:t>Como usuario, quiero clasificar incidentes por tipo y nivel de riesgo para mejorar la organización de los reportes.</w:t>
+            </w:r>
+          </w:p>
+        </w:tc>
+        <w:tc>
+          <w:tcPr>
+            <w:tcW w:type="dxa" w:w="2340"/>
+          </w:tcPr>
+          <w:p>
+            <w:r>
+              <w:t>Media alta</w:t>
+            </w:r>
+          </w:p>
+        </w:tc>
+        <w:tc>
+          <w:tcPr>
+            <w:tcW w:type="dxa" w:w="2340"/>
+          </w:tcPr>
+          <w:p>
+            <w:r>
+              <w:t>Sprint 3</w:t>
+            </w:r>
+          </w:p>
+        </w:tc>
+      </w:tr>
+      <w:tr>
+        <w:tc>
+          <w:tcPr>
+            <w:tcW w:type="dxa" w:w="2340"/>
+          </w:tcPr>
+          <w:p>
+            <w:r>
+              <w:t>HU-07</w:t>
+            </w:r>
+          </w:p>
+        </w:tc>
+        <w:tc>
+          <w:tcPr>
+            <w:tcW w:type="dxa" w:w="2340"/>
+          </w:tcPr>
+          <w:p>
+            <w:r>
+              <w:t>Como moderador, quiero revisar y moderar incidentes reportados para mantener la calidad de la información.</w:t>
+            </w:r>
+          </w:p>
+        </w:tc>
+        <w:tc>
+          <w:tcPr>
+            <w:tcW w:type="dxa" w:w="2340"/>
+          </w:tcPr>
+          <w:p>
+            <w:r>
+              <w:t>Media</w:t>
+            </w:r>
+          </w:p>
+        </w:tc>
+        <w:tc>
+          <w:tcPr>
+            <w:tcW w:type="dxa" w:w="2340"/>
+          </w:tcPr>
+          <w:p>
+            <w:r>
+              <w:t>Sprint 3</w:t>
+            </w:r>
+          </w:p>
+        </w:tc>
+      </w:tr>
+      <w:tr>
+        <w:tc>
+          <w:tcPr>
+            <w:tcW w:type="dxa" w:w="2340"/>
+          </w:tcPr>
+          <w:p>
+            <w:r>
+              <w:t>HU-08</w:t>
+            </w:r>
+          </w:p>
+        </w:tc>
+        <w:tc>
+          <w:tcPr>
+            <w:tcW w:type="dxa" w:w="2340"/>
+          </w:tcPr>
+          <w:p>
+            <w:r>
+              <w:t>Como usuario, quiero ver un resumen de incidentes por comuna y tipo para interpretar tendencias generales.</w:t>
+            </w:r>
+          </w:p>
+        </w:tc>
+        <w:tc>
+          <w:tcPr>
+            <w:tcW w:type="dxa" w:w="2340"/>
+          </w:tcPr>
+          <w:p>
+            <w:r>
+              <w:t>Media</w:t>
+            </w:r>
+          </w:p>
+        </w:tc>
+        <w:tc>
+          <w:tcPr>
+            <w:tcW w:type="dxa" w:w="2340"/>
+          </w:tcPr>
+          <w:p>
+            <w:r>
+              <w:t>Sprint 3</w:t>
+            </w:r>
+          </w:p>
+        </w:tc>
+      </w:tr>
+    </w:tbl>
+    <w:p>
+      <w:pPr>
+        <w:pStyle w:val="Ttulo2"/>
+      </w:pPr>
+      <w:r>
+        <w:t>9.3 Planificación de sprints</w:t>
+      </w:r>
+    </w:p>
+    <w:tbl>
+      <w:tblPr>
+        <w:tblW w:type="auto" w:w="0"/>
+        <w:tblLook w:firstColumn="1" w:firstRow="1" w:lastColumn="0" w:lastRow="0" w:noHBand="0" w:noVBand="1" w:val="04A0"/>
+      </w:tblPr>
+      <w:tblGrid>
+        <w:gridCol w:w="2340"/>
+        <w:gridCol w:w="2340"/>
+        <w:gridCol w:w="2340"/>
+        <w:gridCol w:w="2340"/>
+      </w:tblGrid>
+      <w:tr>
+        <w:tc>
+          <w:tcPr>
+            <w:tcW w:type="dxa" w:w="2340"/>
+          </w:tcPr>
+          <w:p>
+            <w:r>
+              <w:t>Sprint</w:t>
+            </w:r>
+          </w:p>
+        </w:tc>
+        <w:tc>
+          <w:tcPr>
+            <w:tcW w:type="dxa" w:w="2340"/>
+          </w:tcPr>
+          <w:p>
+            <w:r>
+              <w:t>Fechas</w:t>
+            </w:r>
+          </w:p>
+        </w:tc>
+        <w:tc>
+          <w:tcPr>
+            <w:tcW w:type="dxa" w:w="2340"/>
+          </w:tcPr>
+          <w:p>
+            <w:r>
+              <w:t>Objetivo</w:t>
+            </w:r>
+          </w:p>
+        </w:tc>
+        <w:tc>
+          <w:tcPr>
+            <w:tcW w:type="dxa" w:w="2340"/>
+          </w:tcPr>
+          <w:p>
+            <w:r>
+              <w:t>Historias incluidas</w:t>
+            </w:r>
+          </w:p>
+        </w:tc>
+      </w:tr>
+      <w:tr>
+        <w:tc>
+          <w:tcPr>
+            <w:tcW w:type="dxa" w:w="2340"/>
+          </w:tcPr>
+          <w:p>
+            <w:r>
+              <w:t>Sprint 1</w:t>
+            </w:r>
+          </w:p>
+        </w:tc>
+        <w:tc>
+          <w:tcPr>
+            <w:tcW w:type="dxa" w:w="2340"/>
+          </w:tcPr>
+          <w:p>
+            <w:r>
+              <w:t>20/04/2026 - 28/04/2026</w:t>
+            </w:r>
+          </w:p>
+        </w:tc>
+        <w:tc>
+          <w:tcPr>
+            <w:tcW w:type="dxa" w:w="2340"/>
+          </w:tcPr>
+          <w:p>
+            <w:r>
+              <w:t>Implementar el flujo principal de reporte y visualización de incidentes.</w:t>
+            </w:r>
+          </w:p>
+        </w:tc>
+        <w:tc>
+          <w:tcPr>
+            <w:tcW w:type="dxa" w:w="2340"/>
+          </w:tcPr>
+          <w:p>
+            <w:r>
+              <w:t>HU-03, HU-04</w:t>
+            </w:r>
+          </w:p>
+        </w:tc>
+      </w:tr>
+      <w:tr>
+        <w:tc>
+          <w:tcPr>
+            <w:tcW w:type="dxa" w:w="2340"/>
+          </w:tcPr>
+          <w:p>
+            <w:r>
+              <w:t>Sprint 2</w:t>
+            </w:r>
+          </w:p>
+        </w:tc>
+        <w:tc>
+          <w:tcPr>
+            <w:tcW w:type="dxa" w:w="2340"/>
+          </w:tcPr>
+          <w:p>
+            <w:r>
+              <w:t>29/04/2026 - 05/05/2026</w:t>
+            </w:r>
+          </w:p>
+        </w:tc>
+        <w:tc>
+          <w:tcPr>
+            <w:tcW w:type="dxa" w:w="2340"/>
+          </w:tcPr>
+          <w:p>
+            <w:r>
+              <w:t>Incorporar autenticación y filtros para consolidar el uso funcional de la aplicación.</w:t>
+            </w:r>
+          </w:p>
+        </w:tc>
+        <w:tc>
+          <w:tcPr>
+            <w:tcW w:type="dxa" w:w="2340"/>
+          </w:tcPr>
+          <w:p>
+            <w:r>
+              <w:t>HU-01, HU-02, HU-05</w:t>
+            </w:r>
+          </w:p>
+        </w:tc>
+      </w:tr>
+      <w:tr>
+        <w:tc>
+          <w:tcPr>
+            <w:tcW w:type="dxa" w:w="2340"/>
+          </w:tcPr>
+          <w:p>
+            <w:r>
+              <w:t>Sprint 3</w:t>
+            </w:r>
+          </w:p>
+        </w:tc>
+        <w:tc>
+          <w:tcPr>
+            <w:tcW w:type="dxa" w:w="2340"/>
+          </w:tcPr>
+          <w:p>
+            <w:r>
+              <w:t>06/05/2026 - 12/05/2026</w:t>
+            </w:r>
+          </w:p>
+        </w:tc>
+        <w:tc>
+          <w:tcPr>
+            <w:tcW w:type="dxa" w:w="2340"/>
+          </w:tcPr>
+          <w:p>
+            <w:r>
+              <w:t>Mejorar calidad, clasificación y explotación de la información reportada.</w:t>
+            </w:r>
+          </w:p>
+        </w:tc>
+        <w:tc>
+          <w:tcPr>
+            <w:tcW w:type="dxa" w:w="2340"/>
+          </w:tcPr>
+          <w:p>
+            <w:r>
+              <w:t>HU-06, HU-07, HU-08</w:t>
+            </w:r>
+          </w:p>
+        </w:tc>
+      </w:tr>
+    </w:tbl>
+    <w:p>
+      <w:pPr>
+        <w:pStyle w:val="Ttulo2"/>
+      </w:pPr>
+      <w:r>
+        <w:t>9.4 Daily Meeting 2</w:t>
+      </w:r>
+    </w:p>
+    <w:p>
+      <w:r>
+        <w:t>La Daily Meeting 2 se realizó durante el Sprint 1 para revisar el avance de las historias HU-03 y HU-04, considerando que el Sprint 1 finaliza el 28/04/2026.</w:t>
+      </w:r>
+    </w:p>
+    <w:tbl>
+      <w:tblPr>
+        <w:tblW w:type="auto" w:w="0"/>
+        <w:tblLook w:firstColumn="1" w:firstRow="1" w:lastColumn="0" w:lastRow="0" w:noHBand="0" w:noVBand="1" w:val="04A0"/>
+      </w:tblPr>
+      <w:tblGrid>
+        <w:gridCol w:w="4680"/>
+        <w:gridCol w:w="4680"/>
+      </w:tblGrid>
+      <w:tr>
+        <w:tc>
+          <w:tcPr>
+            <w:tcW w:type="dxa" w:w="4680"/>
+          </w:tcPr>
+          <w:p>
+            <w:r>
+              <w:t>Campo</w:t>
+            </w:r>
+          </w:p>
+        </w:tc>
+        <w:tc>
+          <w:tcPr>
+            <w:tcW w:type="dxa" w:w="4680"/>
+          </w:tcPr>
+          <w:p>
+            <w:r>
+              <w:t>Detalle</w:t>
+            </w:r>
+          </w:p>
+        </w:tc>
+      </w:tr>
+      <w:tr>
+        <w:tc>
+          <w:tcPr>
+            <w:tcW w:type="dxa" w:w="4680"/>
+          </w:tcPr>
+          <w:p>
+            <w:r>
+              <w:t>Fecha</w:t>
+            </w:r>
+          </w:p>
+        </w:tc>
+        <w:tc>
+          <w:tcPr>
+            <w:tcW w:type="dxa" w:w="4680"/>
+          </w:tcPr>
+          <w:p>
+            <w:r>
+              <w:t>27/04/2026</w:t>
+            </w:r>
+          </w:p>
+        </w:tc>
+      </w:tr>
+      <w:tr>
+        <w:tc>
+          <w:tcPr>
+            <w:tcW w:type="dxa" w:w="4680"/>
+          </w:tcPr>
+          <w:p>
+            <w:r>
+              <w:t>Hora</w:t>
+            </w:r>
+          </w:p>
+        </w:tc>
+        <w:tc>
+          <w:tcPr>
+            <w:tcW w:type="dxa" w:w="4680"/>
+          </w:tcPr>
+          <w:p>
+            <w:r>
+              <w:t>18:00</w:t>
+            </w:r>
+          </w:p>
+        </w:tc>
+      </w:tr>
+      <w:tr>
+        <w:tc>
+          <w:tcPr>
+            <w:tcW w:type="dxa" w:w="4680"/>
+          </w:tcPr>
+          <w:p>
+            <w:r>
+              <w:t>Medio</w:t>
+            </w:r>
+          </w:p>
+        </w:tc>
+        <w:tc>
+          <w:tcPr>
+            <w:tcW w:type="dxa" w:w="4680"/>
+          </w:tcPr>
+          <w:p>
+            <w:r>
+              <w:t>Discord</w:t>
+            </w:r>
+          </w:p>
+        </w:tc>
+      </w:tr>
+      <w:tr>
+        <w:tc>
+          <w:tcPr>
+            <w:tcW w:type="dxa" w:w="4680"/>
+          </w:tcPr>
+          <w:p>
+            <w:r>
+              <w:t>Sprint</w:t>
+            </w:r>
+          </w:p>
+        </w:tc>
+        <w:tc>
+          <w:tcPr>
+            <w:tcW w:type="dxa" w:w="4680"/>
+          </w:tcPr>
+          <w:p>
+            <w:r>
+              <w:t>Sprint 1</w:t>
+            </w:r>
+          </w:p>
+        </w:tc>
+      </w:tr>
+      <w:tr>
+        <w:tc>
+          <w:tcPr>
+            <w:tcW w:type="dxa" w:w="4680"/>
+          </w:tcPr>
+          <w:p>
+            <w:r>
+              <w:t>Fecha de cierre del sprint</w:t>
+            </w:r>
+          </w:p>
+        </w:tc>
+        <w:tc>
+          <w:tcPr>
+            <w:tcW w:type="dxa" w:w="4680"/>
+          </w:tcPr>
+          <w:p>
+            <w:r>
+              <w:t>28/04/2026</w:t>
+            </w:r>
+          </w:p>
+        </w:tc>
+      </w:tr>
+    </w:tbl>
+    <w:tbl>
+      <w:tblPr>
+        <w:tblW w:type="auto" w:w="0"/>
+        <w:tblLook w:firstColumn="1" w:firstRow="1" w:lastColumn="0" w:lastRow="0" w:noHBand="0" w:noVBand="1" w:val="04A0"/>
+      </w:tblPr>
+      <w:tblGrid>
+        <w:gridCol w:w="4680"/>
+        <w:gridCol w:w="4680"/>
+      </w:tblGrid>
+      <w:tr>
+        <w:tc>
+          <w:tcPr>
+            <w:tcW w:type="dxa" w:w="4680"/>
+          </w:tcPr>
+          <w:p>
+            <w:r>
+              <w:t>Integrante</w:t>
+            </w:r>
+          </w:p>
+        </w:tc>
+        <w:tc>
+          <w:tcPr>
+            <w:tcW w:type="dxa" w:w="4680"/>
+          </w:tcPr>
+          <w:p>
+            <w:r>
+              <w:t>Rol / foco de trabajo</w:t>
+            </w:r>
+          </w:p>
+        </w:tc>
+      </w:tr>
+      <w:tr>
+        <w:tc>
+          <w:tcPr>
+            <w:tcW w:type="dxa" w:w="4680"/>
+          </w:tcPr>
+          <w:p>
+            <w:r>
+              <w:t>benjaosan</w:t>
+            </w:r>
+          </w:p>
+        </w:tc>
+        <w:tc>
+          <w:tcPr>
+            <w:tcW w:type="dxa" w:w="4680"/>
+          </w:tcPr>
+          <w:p>
+            <w:r>
+              <w:t>Frontend: formulario de reporte, geolocalización, mapa y marcadores.</w:t>
+            </w:r>
+          </w:p>
+        </w:tc>
+      </w:tr>
+      <w:tr>
+        <w:tc>
+          <w:tcPr>
+            <w:tcW w:type="dxa" w:w="4680"/>
+          </w:tcPr>
+          <w:p>
+            <w:r>
+              <w:t>Sebastián López Cisternas</w:t>
+            </w:r>
+          </w:p>
+        </w:tc>
+        <w:tc>
+          <w:tcPr>
+            <w:tcW w:type="dxa" w:w="4680"/>
+          </w:tcPr>
+          <w:p>
+            <w:r>
+              <w:t>Backend: modelo de incidente, endpoints y validación de token.</w:t>
+            </w:r>
+          </w:p>
+        </w:tc>
+      </w:tr>
+      <w:tr>
+        <w:tc>
+          <w:tcPr>
+            <w:tcW w:type="dxa" w:w="4680"/>
+          </w:tcPr>
+          <w:p>
+            <w:r>
+              <w:t>Felipe Vergara R</w:t>
+            </w:r>
+          </w:p>
+        </w:tc>
+        <w:tc>
+          <w:tcPr>
+            <w:tcW w:type="dxa" w:w="4680"/>
+          </w:tcPr>
+          <w:p>
+            <w:r>
+              <w:t>Validación funcional: criterios de aceptación y pruebas de flujo.</w:t>
+            </w:r>
+          </w:p>
+        </w:tc>
+      </w:tr>
+      <w:tr>
+        <w:tc>
+          <w:tcPr>
+            <w:tcW w:type="dxa" w:w="4680"/>
+          </w:tcPr>
+          <w:p>
+            <w:r>
+              <w:t>lucasmaulenr</w:t>
+            </w:r>
+          </w:p>
+        </w:tc>
+        <w:tc>
+          <w:tcPr>
+            <w:tcW w:type="dxa" w:w="4680"/>
+          </w:tcPr>
+          <w:p>
+            <w:r>
+              <w:t>Product Owner: priorización, documentación y seguimiento en Taiga.</w:t>
+            </w:r>
+          </w:p>
+        </w:tc>
+      </w:tr>
+    </w:tbl>
+    <w:p>
+      <w:pPr>
+        <w:pStyle w:val="Ttulo2"/>
+      </w:pPr>
+      <w:r>
+        <w:t>9.5 Tareas técnicas registradas en Taiga</w:t>
+      </w:r>
+    </w:p>
+    <w:p>
+      <w:r>
+        <w:t>Las tareas del Scrum Team para Sprint 1 se definieron en base a las historias de usuario HU-03 y HU-04.</w:t>
+      </w:r>
+    </w:p>
+    <w:tbl>
+      <w:tblPr>
+        <w:tblW w:type="auto" w:w="0"/>
+        <w:tblLook w:firstColumn="1" w:firstRow="1" w:lastColumn="0" w:lastRow="0" w:noHBand="0" w:noVBand="1" w:val="04A0"/>
+      </w:tblPr>
+      <w:tblGrid>
+        <w:gridCol w:w="2340"/>
+        <w:gridCol w:w="2340"/>
+        <w:gridCol w:w="2340"/>
+        <w:gridCol w:w="2340"/>
+      </w:tblGrid>
+      <w:tr>
+        <w:tc>
+          <w:tcPr>
+            <w:tcW w:type="dxa" w:w="2340"/>
+          </w:tcPr>
+          <w:p>
+            <w:r>
+              <w:t>Ref</w:t>
+            </w:r>
+          </w:p>
+        </w:tc>
+        <w:tc>
+          <w:tcPr>
+            <w:tcW w:type="dxa" w:w="2340"/>
+          </w:tcPr>
+          <w:p>
+            <w:r>
+              <w:t>HU</w:t>
+            </w:r>
+          </w:p>
+        </w:tc>
+        <w:tc>
+          <w:tcPr>
+            <w:tcW w:type="dxa" w:w="2340"/>
+          </w:tcPr>
+          <w:p>
+            <w:r>
+              <w:t>Tarea</w:t>
+            </w:r>
+          </w:p>
+        </w:tc>
+        <w:tc>
+          <w:tcPr>
+            <w:tcW w:type="dxa" w:w="2340"/>
+          </w:tcPr>
+          <w:p>
+            <w:r>
+              <w:t>Responsable</w:t>
+            </w:r>
+          </w:p>
+        </w:tc>
+      </w:tr>
+      <w:tr>
+        <w:tc>
+          <w:tcPr>
+            <w:tcW w:type="dxa" w:w="2340"/>
+          </w:tcPr>
+          <w:p>
+            <w:r>
+              <w:t>#6</w:t>
+            </w:r>
+          </w:p>
+        </w:tc>
+        <w:tc>
+          <w:tcPr>
+            <w:tcW w:type="dxa" w:w="2340"/>
+          </w:tcPr>
+          <w:p>
+            <w:r>
+              <w:t>HU-03</w:t>
+            </w:r>
+          </w:p>
+        </w:tc>
+        <w:tc>
+          <w:tcPr>
+            <w:tcW w:type="dxa" w:w="2340"/>
+          </w:tcPr>
+          <w:p>
+            <w:r>
+              <w:t>[Front] Crear formulario de reporte de incidente</w:t>
+            </w:r>
+          </w:p>
+        </w:tc>
+        <w:tc>
+          <w:tcPr>
+            <w:tcW w:type="dxa" w:w="2340"/>
+          </w:tcPr>
+          <w:p>
+            <w:r>
+              <w:t>benjaosan</w:t>
+            </w:r>
+          </w:p>
+        </w:tc>
+      </w:tr>
+      <w:tr>
+        <w:tc>
+          <w:tcPr>
+            <w:tcW w:type="dxa" w:w="2340"/>
+          </w:tcPr>
+          <w:p>
+            <w:r>
+              <w:t>#7</w:t>
+            </w:r>
+          </w:p>
+        </w:tc>
+        <w:tc>
+          <w:tcPr>
+            <w:tcW w:type="dxa" w:w="2340"/>
+          </w:tcPr>
+          <w:p>
+            <w:r>
+              <w:t>HU-03</w:t>
+            </w:r>
+          </w:p>
+        </w:tc>
+        <w:tc>
+          <w:tcPr>
+            <w:tcW w:type="dxa" w:w="2340"/>
+          </w:tcPr>
+          <w:p>
+            <w:r>
+              <w:t>[Front] Integrar Geolocation API</w:t>
+            </w:r>
+          </w:p>
+        </w:tc>
+        <w:tc>
+          <w:tcPr>
+            <w:tcW w:type="dxa" w:w="2340"/>
+          </w:tcPr>
+          <w:p>
+            <w:r>
+              <w:t>benjaosan</w:t>
+            </w:r>
+          </w:p>
+        </w:tc>
+      </w:tr>
+      <w:tr>
+        <w:tc>
+          <w:tcPr>
+            <w:tcW w:type="dxa" w:w="2340"/>
+          </w:tcPr>
+          <w:p>
+            <w:r>
+              <w:t>#8</w:t>
+            </w:r>
+          </w:p>
+        </w:tc>
+        <w:tc>
+          <w:tcPr>
+            <w:tcW w:type="dxa" w:w="2340"/>
+          </w:tcPr>
+          <w:p>
+            <w:r>
+              <w:t>HU-03</w:t>
+            </w:r>
+          </w:p>
+        </w:tc>
+        <w:tc>
+          <w:tcPr>
+            <w:tcW w:type="dxa" w:w="2340"/>
+          </w:tcPr>
+          <w:p>
+            <w:r>
+              <w:t>[Back] Definir modelo de incidente</w:t>
+            </w:r>
+          </w:p>
+        </w:tc>
+        <w:tc>
+          <w:tcPr>
+            <w:tcW w:type="dxa" w:w="2340"/>
+          </w:tcPr>
+          <w:p>
+            <w:r>
+              <w:t>Sebastián López Cisternas</w:t>
+            </w:r>
+          </w:p>
+        </w:tc>
+      </w:tr>
+      <w:tr>
+        <w:tc>
+          <w:tcPr>
+            <w:tcW w:type="dxa" w:w="2340"/>
+          </w:tcPr>
+          <w:p>
+            <w:r>
+              <w:t>#9</w:t>
+            </w:r>
+          </w:p>
+        </w:tc>
+        <w:tc>
+          <w:tcPr>
+            <w:tcW w:type="dxa" w:w="2340"/>
+          </w:tcPr>
+          <w:p>
+            <w:r>
+              <w:t>HU-03</w:t>
+            </w:r>
+          </w:p>
+        </w:tc>
+        <w:tc>
+          <w:tcPr>
+            <w:tcW w:type="dxa" w:w="2340"/>
+          </w:tcPr>
+          <w:p>
+            <w:r>
+              <w:t>[Back] Crear endpoint para registrar incidente</w:t>
+            </w:r>
+          </w:p>
+        </w:tc>
+        <w:tc>
+          <w:tcPr>
+            <w:tcW w:type="dxa" w:w="2340"/>
+          </w:tcPr>
+          <w:p>
+            <w:r>
+              <w:t>Sebastián López Cisternas</w:t>
+            </w:r>
+          </w:p>
+        </w:tc>
+      </w:tr>
+      <w:tr>
+        <w:tc>
+          <w:tcPr>
+            <w:tcW w:type="dxa" w:w="2340"/>
+          </w:tcPr>
+          <w:p>
+            <w:r>
+              <w:t>#10</w:t>
+            </w:r>
+          </w:p>
+        </w:tc>
+        <w:tc>
+          <w:tcPr>
+            <w:tcW w:type="dxa" w:w="2340"/>
+          </w:tcPr>
+          <w:p>
+            <w:r>
+              <w:t>HU-03</w:t>
+            </w:r>
+          </w:p>
+        </w:tc>
+        <w:tc>
+          <w:tcPr>
+            <w:tcW w:type="dxa" w:w="2340"/>
+          </w:tcPr>
+          <w:p>
+            <w:r>
+              <w:t>[Back] Validar token y registrar fecha/hora</w:t>
+            </w:r>
+          </w:p>
+        </w:tc>
+        <w:tc>
+          <w:tcPr>
+            <w:tcW w:type="dxa" w:w="2340"/>
+          </w:tcPr>
+          <w:p>
+            <w:r>
+              <w:t>Sebastián López Cisternas</w:t>
+            </w:r>
+          </w:p>
+        </w:tc>
+      </w:tr>
+      <w:tr>
+        <w:tc>
+          <w:tcPr>
+            <w:tcW w:type="dxa" w:w="2340"/>
+          </w:tcPr>
+          <w:p>
+            <w:r>
+              <w:t>#11</w:t>
+            </w:r>
+          </w:p>
+        </w:tc>
+        <w:tc>
+          <w:tcPr>
+            <w:tcW w:type="dxa" w:w="2340"/>
+          </w:tcPr>
+          <w:p>
+            <w:r>
+              <w:t>HU-04</w:t>
+            </w:r>
+          </w:p>
+        </w:tc>
+        <w:tc>
+          <w:tcPr>
+            <w:tcW w:type="dxa" w:w="2340"/>
+          </w:tcPr>
+          <w:p>
+            <w:r>
+              <w:t>[Front] Crear vista de mapa con Leaflet</w:t>
+            </w:r>
+          </w:p>
+        </w:tc>
+        <w:tc>
+          <w:tcPr>
+            <w:tcW w:type="dxa" w:w="2340"/>
+          </w:tcPr>
+          <w:p>
+            <w:r>
+              <w:t>benjaosan</w:t>
+            </w:r>
+          </w:p>
+        </w:tc>
+      </w:tr>
+      <w:tr>
+        <w:tc>
+          <w:tcPr>
+            <w:tcW w:type="dxa" w:w="2340"/>
+          </w:tcPr>
+          <w:p>
+            <w:r>
+              <w:t>#12</w:t>
+            </w:r>
+          </w:p>
+        </w:tc>
+        <w:tc>
+          <w:tcPr>
+            <w:tcW w:type="dxa" w:w="2340"/>
+          </w:tcPr>
+          <w:p>
+            <w:r>
+              <w:t>HU-04</w:t>
+            </w:r>
+          </w:p>
+        </w:tc>
+        <w:tc>
+          <w:tcPr>
+            <w:tcW w:type="dxa" w:w="2340"/>
+          </w:tcPr>
+          <w:p>
+            <w:r>
+              <w:t>[Front] Renderizar marcadores y popup informativo</w:t>
+            </w:r>
+          </w:p>
+        </w:tc>
+        <w:tc>
+          <w:tcPr>
+            <w:tcW w:type="dxa" w:w="2340"/>
+          </w:tcPr>
+          <w:p>
+            <w:r>
+              <w:t>benjaosan</w:t>
+            </w:r>
+          </w:p>
+        </w:tc>
+      </w:tr>
+      <w:tr>
+        <w:tc>
+          <w:tcPr>
+            <w:tcW w:type="dxa" w:w="2340"/>
+          </w:tcPr>
+          <w:p>
+            <w:r>
+              <w:t>#13</w:t>
+            </w:r>
+          </w:p>
+        </w:tc>
+        <w:tc>
+          <w:tcPr>
+            <w:tcW w:type="dxa" w:w="2340"/>
+          </w:tcPr>
+          <w:p>
+            <w:r>
+              <w:t>HU-04</w:t>
+            </w:r>
+          </w:p>
+        </w:tc>
+        <w:tc>
+          <w:tcPr>
+            <w:tcW w:type="dxa" w:w="2340"/>
+          </w:tcPr>
+          <w:p>
+            <w:r>
+              <w:t>[Back] Crear endpoint para listar incidentes</w:t>
+            </w:r>
+          </w:p>
+        </w:tc>
+        <w:tc>
+          <w:tcPr>
+            <w:tcW w:type="dxa" w:w="2340"/>
+          </w:tcPr>
+          <w:p>
+            <w:r>
+              <w:t>Sebastián López Cisternas</w:t>
+            </w:r>
+          </w:p>
+        </w:tc>
+      </w:tr>
+      <w:tr>
+        <w:tc>
+          <w:tcPr>
+            <w:tcW w:type="dxa" w:w="2340"/>
+          </w:tcPr>
+          <w:p>
+            <w:r>
+              <w:t>#14</w:t>
+            </w:r>
+          </w:p>
+        </w:tc>
+        <w:tc>
+          <w:tcPr>
+            <w:tcW w:type="dxa" w:w="2340"/>
+          </w:tcPr>
+          <w:p>
+            <w:r>
+              <w:t>HU-04</w:t>
+            </w:r>
+          </w:p>
+        </w:tc>
+        <w:tc>
+          <w:tcPr>
+            <w:tcW w:type="dxa" w:w="2340"/>
+          </w:tcPr>
+          <w:p>
+            <w:r>
+              <w:t>[Front] Ajustar mapa responsive para móvil</w:t>
+            </w:r>
+          </w:p>
+        </w:tc>
+        <w:tc>
+          <w:tcPr>
+            <w:tcW w:type="dxa" w:w="2340"/>
+          </w:tcPr>
+          <w:p>
+            <w:r>
+              <w:t>benjaosan</w:t>
+            </w:r>
+          </w:p>
+        </w:tc>
+      </w:tr>
+    </w:tbl>
+    <w:p>
+      <w:pPr>
+        <w:pStyle w:val="Ttulo2"/>
+      </w:pPr>
+      <w:r>
+        <w:t>9.6 Requisitos y trazabilidad</w:t>
+      </w:r>
+    </w:p>
+    <w:tbl>
+      <w:tblPr>
+        <w:tblW w:type="auto" w:w="0"/>
+        <w:tblLook w:firstColumn="1" w:firstRow="1" w:lastColumn="0" w:lastRow="0" w:noHBand="0" w:noVBand="1" w:val="04A0"/>
+      </w:tblPr>
+      <w:tblGrid>
+        <w:gridCol w:w="3120"/>
+        <w:gridCol w:w="3120"/>
+        <w:gridCol w:w="3120"/>
+      </w:tblGrid>
+      <w:tr>
+        <w:tc>
+          <w:tcPr>
+            <w:tcW w:type="dxa" w:w="3120"/>
+          </w:tcPr>
+          <w:p>
+            <w:r>
+              <w:t>ID</w:t>
+            </w:r>
+          </w:p>
+        </w:tc>
+        <w:tc>
+          <w:tcPr>
+            <w:tcW w:type="dxa" w:w="3120"/>
+          </w:tcPr>
+          <w:p>
+            <w:r>
+              <w:t>Requisito funcional</w:t>
+            </w:r>
+          </w:p>
+        </w:tc>
+        <w:tc>
+          <w:tcPr>
+            <w:tcW w:type="dxa" w:w="3120"/>
+          </w:tcPr>
+          <w:p>
+            <w:r>
+              <w:t>HU relacionada</w:t>
+            </w:r>
+          </w:p>
+        </w:tc>
+      </w:tr>
+      <w:tr>
+        <w:tc>
+          <w:tcPr>
+            <w:tcW w:type="dxa" w:w="3120"/>
+          </w:tcPr>
+          <w:p>
+            <w:r>
+              <w:t>RF-01</w:t>
+            </w:r>
+          </w:p>
+        </w:tc>
+        <w:tc>
+          <w:tcPr>
+            <w:tcW w:type="dxa" w:w="3120"/>
+          </w:tcPr>
+          <w:p>
+            <w:r>
+              <w:t>Permitir registro de usuarios con correo y contraseña.</w:t>
+            </w:r>
+          </w:p>
+        </w:tc>
+        <w:tc>
+          <w:tcPr>
+            <w:tcW w:type="dxa" w:w="3120"/>
+          </w:tcPr>
+          <w:p>
+            <w:r>
+              <w:t>HU-01</w:t>
+            </w:r>
+          </w:p>
+        </w:tc>
+      </w:tr>
+      <w:tr>
+        <w:tc>
+          <w:tcPr>
+            <w:tcW w:type="dxa" w:w="3120"/>
+          </w:tcPr>
+          <w:p>
+            <w:r>
+              <w:t>RF-02</w:t>
+            </w:r>
+          </w:p>
+        </w:tc>
+        <w:tc>
+          <w:tcPr>
+            <w:tcW w:type="dxa" w:w="3120"/>
+          </w:tcPr>
+          <w:p>
+            <w:r>
+              <w:t>Permitir inicio de sesión con mecanismo seguro de autenticación.</w:t>
+            </w:r>
+          </w:p>
+        </w:tc>
+        <w:tc>
+          <w:tcPr>
+            <w:tcW w:type="dxa" w:w="3120"/>
+          </w:tcPr>
+          <w:p>
+            <w:r>
+              <w:t>HU-02</w:t>
+            </w:r>
+          </w:p>
+        </w:tc>
+      </w:tr>
+      <w:tr>
+        <w:tc>
+          <w:tcPr>
+            <w:tcW w:type="dxa" w:w="3120"/>
+          </w:tcPr>
+          <w:p>
+            <w:r>
+              <w:t>RF-03</w:t>
+            </w:r>
+          </w:p>
+        </w:tc>
+        <w:tc>
+          <w:tcPr>
+            <w:tcW w:type="dxa" w:w="3120"/>
+          </w:tcPr>
+          <w:p>
+            <w:r>
+              <w:t>Permitir crear reportes de incidentes con descripción, categoría y ubicación.</w:t>
+            </w:r>
+          </w:p>
+        </w:tc>
+        <w:tc>
+          <w:tcPr>
+            <w:tcW w:type="dxa" w:w="3120"/>
+          </w:tcPr>
+          <w:p>
+            <w:r>
+              <w:t>HU-03</w:t>
+            </w:r>
+          </w:p>
+        </w:tc>
+      </w:tr>
+      <w:tr>
+        <w:tc>
+          <w:tcPr>
+            <w:tcW w:type="dxa" w:w="3120"/>
+          </w:tcPr>
+          <w:p>
+            <w:r>
+              <w:t>RF-04</w:t>
+            </w:r>
+          </w:p>
+        </w:tc>
+        <w:tc>
+          <w:tcPr>
+            <w:tcW w:type="dxa" w:w="3120"/>
+          </w:tcPr>
+          <w:p>
+            <w:r>
+              <w:t>Persistir fecha, hora, ubicación y usuario asociado al incidente.</w:t>
+            </w:r>
+          </w:p>
+        </w:tc>
+        <w:tc>
+          <w:tcPr>
+            <w:tcW w:type="dxa" w:w="3120"/>
+          </w:tcPr>
+          <w:p>
+            <w:r>
+              <w:t>HU-03</w:t>
+            </w:r>
+          </w:p>
+        </w:tc>
+      </w:tr>
+      <w:tr>
+        <w:tc>
+          <w:tcPr>
+            <w:tcW w:type="dxa" w:w="3120"/>
+          </w:tcPr>
+          <w:p>
+            <w:r>
+              <w:t>RF-05</w:t>
+            </w:r>
+          </w:p>
+        </w:tc>
+        <w:tc>
+          <w:tcPr>
+            <w:tcW w:type="dxa" w:w="3120"/>
+          </w:tcPr>
+          <w:p>
+            <w:r>
+              <w:t>Visualizar incidentes georreferenciados en un mapa interactivo.</w:t>
+            </w:r>
+          </w:p>
+        </w:tc>
+        <w:tc>
+          <w:tcPr>
+            <w:tcW w:type="dxa" w:w="3120"/>
+          </w:tcPr>
+          <w:p>
+            <w:r>
+              <w:t>HU-04</w:t>
+            </w:r>
+          </w:p>
+        </w:tc>
+      </w:tr>
+      <w:tr>
+        <w:tc>
+          <w:tcPr>
+            <w:tcW w:type="dxa" w:w="3120"/>
+          </w:tcPr>
+          <w:p>
+            <w:r>
+              <w:t>RF-06</w:t>
+            </w:r>
+          </w:p>
+        </w:tc>
+        <w:tc>
+          <w:tcPr>
+            <w:tcW w:type="dxa" w:w="3120"/>
+          </w:tcPr>
+          <w:p>
+            <w:r>
+              <w:t>Filtrar incidentes por comuna y fecha.</w:t>
+            </w:r>
+          </w:p>
+        </w:tc>
+        <w:tc>
+          <w:tcPr>
+            <w:tcW w:type="dxa" w:w="3120"/>
+          </w:tcPr>
+          <w:p>
+            <w:r>
+              <w:t>HU-05</w:t>
+            </w:r>
+          </w:p>
+        </w:tc>
+      </w:tr>
+      <w:tr>
+        <w:tc>
+          <w:tcPr>
+            <w:tcW w:type="dxa" w:w="3120"/>
+          </w:tcPr>
+          <w:p>
+            <w:r>
+              <w:t>RF-07</w:t>
+            </w:r>
+          </w:p>
+        </w:tc>
+        <w:tc>
+          <w:tcPr>
+            <w:tcW w:type="dxa" w:w="3120"/>
+          </w:tcPr>
+          <w:p>
+            <w:r>
+              <w:t>Clasificar incidentes por tipo y nivel de riesgo.</w:t>
+            </w:r>
+          </w:p>
+        </w:tc>
+        <w:tc>
+          <w:tcPr>
+            <w:tcW w:type="dxa" w:w="3120"/>
+          </w:tcPr>
+          <w:p>
+            <w:r>
+              <w:t>HU-06</w:t>
+            </w:r>
+          </w:p>
+        </w:tc>
+      </w:tr>
+      <w:tr>
+        <w:tc>
+          <w:tcPr>
+            <w:tcW w:type="dxa" w:w="3120"/>
+          </w:tcPr>
+          <w:p>
+            <w:r>
+              <w:t>RF-08</w:t>
+            </w:r>
+          </w:p>
+        </w:tc>
+        <w:tc>
+          <w:tcPr>
+            <w:tcW w:type="dxa" w:w="3120"/>
+          </w:tcPr>
+          <w:p>
+            <w:r>
+              <w:t>Permitir moderación y revisión de reportes.</w:t>
+            </w:r>
+          </w:p>
+        </w:tc>
+        <w:tc>
+          <w:tcPr>
+            <w:tcW w:type="dxa" w:w="3120"/>
+          </w:tcPr>
+          <w:p>
+            <w:r>
+              <w:t>HU-07</w:t>
+            </w:r>
+          </w:p>
+        </w:tc>
+      </w:tr>
+    </w:tbl>
+    <w:tbl>
+      <w:tblPr>
+        <w:tblW w:type="auto" w:w="0"/>
+        <w:tblLook w:firstColumn="1" w:firstRow="1" w:lastColumn="0" w:lastRow="0" w:noHBand="0" w:noVBand="1" w:val="04A0"/>
+      </w:tblPr>
+      <w:tblGrid>
+        <w:gridCol w:w="4680"/>
+        <w:gridCol w:w="4680"/>
+      </w:tblGrid>
+      <w:tr>
+        <w:tc>
+          <w:tcPr>
+            <w:tcW w:type="dxa" w:w="4680"/>
+          </w:tcPr>
+          <w:p>
+            <w:r>
+              <w:t>ID</w:t>
+            </w:r>
+          </w:p>
+        </w:tc>
+        <w:tc>
+          <w:tcPr>
+            <w:tcW w:type="dxa" w:w="4680"/>
+          </w:tcPr>
+          <w:p>
+            <w:r>
+              <w:t>Requisito no funcional</w:t>
+            </w:r>
+          </w:p>
+        </w:tc>
+      </w:tr>
+      <w:tr>
+        <w:tc>
+          <w:tcPr>
+            <w:tcW w:type="dxa" w:w="4680"/>
+          </w:tcPr>
+          <w:p>
+            <w:r>
+              <w:t>RNF-01</w:t>
+            </w:r>
+          </w:p>
+        </w:tc>
+        <w:tc>
+          <w:tcPr>
+            <w:tcW w:type="dxa" w:w="4680"/>
+          </w:tcPr>
+          <w:p>
+            <w:r>
+              <w:t>La interfaz debe ser usable en escritorio y móvil.</w:t>
+            </w:r>
+          </w:p>
+        </w:tc>
+      </w:tr>
+      <w:tr>
+        <w:tc>
+          <w:tcPr>
+            <w:tcW w:type="dxa" w:w="4680"/>
+          </w:tcPr>
+          <w:p>
+            <w:r>
+              <w:t>RNF-02</w:t>
+            </w:r>
+          </w:p>
+        </w:tc>
+        <w:tc>
+          <w:tcPr>
+            <w:tcW w:type="dxa" w:w="4680"/>
+          </w:tcPr>
+          <w:p>
+            <w:r>
+              <w:t>Los endpoints protegidos deben validar autenticación antes de procesar solicitudes.</w:t>
+            </w:r>
+          </w:p>
+        </w:tc>
+      </w:tr>
+      <w:tr>
+        <w:tc>
+          <w:tcPr>
+            <w:tcW w:type="dxa" w:w="4680"/>
+          </w:tcPr>
+          <w:p>
+            <w:r>
+              <w:t>RNF-03</w:t>
+            </w:r>
+          </w:p>
+        </w:tc>
+        <w:tc>
+          <w:tcPr>
+            <w:tcW w:type="dxa" w:w="4680"/>
+          </w:tcPr>
+          <w:p>
+            <w:r>
+              <w:t>La visualización del mapa debe cargar marcadores sin bloquear la navegación principal.</w:t>
+            </w:r>
+          </w:p>
+        </w:tc>
+      </w:tr>
+      <w:tr>
+        <w:tc>
+          <w:tcPr>
+            <w:tcW w:type="dxa" w:w="4680"/>
+          </w:tcPr>
+          <w:p>
+            <w:r>
+              <w:t>RNF-04</w:t>
+            </w:r>
+          </w:p>
+        </w:tc>
+        <w:tc>
+          <w:tcPr>
+            <w:tcW w:type="dxa" w:w="4680"/>
+          </w:tcPr>
+          <w:p>
+            <w:r>
+              <w:t>La documentación del proyecto debe mantenerse sincronizada con Taiga y el repositorio.</w:t>
+            </w:r>
+          </w:p>
+        </w:tc>
+      </w:tr>
+      <w:tr>
+        <w:tc>
+          <w:tcPr>
+            <w:tcW w:type="dxa" w:w="4680"/>
+          </w:tcPr>
+          <w:p>
+            <w:r>
+              <w:t>RNF-05</w:t>
+            </w:r>
+          </w:p>
+        </w:tc>
+        <w:tc>
+          <w:tcPr>
+            <w:tcW w:type="dxa" w:w="4680"/>
+          </w:tcPr>
+          <w:p>
+            <w:r>
+              <w:t>Los datos sensibles de autenticación no deben exponerse en documentación ni commits.</w:t>
+            </w:r>
+          </w:p>
+        </w:tc>
+      </w:tr>
+    </w:tbl>
+    <w:p>
+      <w:pPr>
+        <w:pStyle w:val="Ttulo2"/>
+      </w:pPr>
+      <w:r>
+        <w:t>9.7 Criterios generales de aceptación</w:t>
+      </w:r>
+    </w:p>
+    <w:p>
+      <w:r>
+        <w:t>1. Las funcionalidades del MVP deben poder ejecutarse desde la interfaz web sin intervención manual en base de datos.</w:t>
+      </w:r>
+    </w:p>
+    <w:p>
+      <w:r>
+        <w:t>2. Cada historia de usuario debe contar con tareas técnicas asociadas y estado actualizado en Taiga.</w:t>
+      </w:r>
+    </w:p>
+    <w:p>
+      <w:r>
+        <w:t>3. El tablero debe reflejar los tres sprints del proyecto y sus fechas de ejecución.</w:t>
+      </w:r>
+    </w:p>
+    <w:p>
+      <w:r>
+        <w:t>4. El flujo mínimo debe permitir registrar un incidente y visualizarlo posteriormente en el mapa.</w:t>
+      </w:r>
+    </w:p>
+    <w:p>
+      <w:r>
+        <w:t>5. La documentación del repositorio debe indicar que el único documento DOCX mantenido es VigilData_Arquitectura_4+1_v2.docx.</w:t>
       </w:r>
     </w:p>
     <w:sectPr>

</xml_diff>